<commit_message>
Add Skymet/PoCRA data sources, boundary/color fixes, district renames
- Historical Data tab: new Skymet/PoCRA source alongside IMD (etr_skymet.py),
  built from PoCRA's automatic weather station network (2022-2026)
- Point Lookup: new "Skymet live (nearest station)" option using the real
  PoCRA/Skymet REST API for current/recent observed data (no forecast -
  confirmed the API rejects future dates)
- Statewide map: green-yellow-red color scale, bold state/district/taluka
  boundary hierarchy at every zoom level; Point Lookup boundaries redesigned
  to match (transparent, same hierarchy)
- Fixed a systematic character-encoding corruption in 21 taluka names and
  applied the official Maharashtra district renames (Ahilyanagar,
  Chhatrapati Sambhajinagar, Dharashiv)
- Rate-limit resilience (retry/backoff) for the statewide map's weather fetch

Co-Authored-By: Claude Sonnet 5 <noreply@anthropic.com>
</commit_message>
<xml_diff>
--- a/Project_Report.docx
+++ b/Project_Report.docx
@@ -1056,7 +1056,23 @@
         <w:pStyle w:val="ListBullet"/>
       </w:pPr>
       <w:r>
-        <w:t>(none yet)</w:t>
+        <w:t>Second data source added to the Historical Data tab: Skymet/PoCRA, alongside IMD. PoCRA (Project on Climate Resilient Agriculture) operates an automatic weather station (AWS) network across Maharashtra, run by Skymet, far denser than IMD's 39 fixed grid points (1,400-2,300+ real stations, growing over time). A new module (etr_skymet.py) aggregates hourly Tmax/Tmin per station to daily, computes Hargreaves ETR per station, then averages whichever stations actually reported that day into state/district/taluka values - the same output schema as the IMD archive, so the app's UI and download logic are shared between both sources with just a data-source selector added.</w:t>
+      </w:r>
+    </w:p>
+    <w:p>
+      <w:pPr>
+        <w:pStyle w:val="ListBullet"/>
+      </w:pPr>
+      <w:r>
+        <w:t>Unlike IMD's fixed, always-complete network, PoCRA station coverage genuinely varies: station count changes year to year, there is a real network-wide gap from Nov 2022 to mid-2023, and per-unit data availability differs (e.g. some districts' stations only came online partway through 2022 or 2023). Rather than estimating over these gaps, missing dates are shown as NA in the table/CSV and as a break in the chart line - and Mumbai City and Mumbai Suburban districts correctly show no data at all, since PoCRA is an agricultural monitoring network with no stations in those fully urban districts.</w:t>
+      </w:r>
+    </w:p>
+    <w:p>
+      <w:pPr>
+        <w:pStyle w:val="ListBullet"/>
+      </w:pPr>
+      <w:r>
+        <w:t>Live Skymet option added to Point Lookup: a third source, "Skymet live (nearest station)", alongside the existing Open-Meteo forecast/historical options. Clicking a point finds the nearest real PoCRA weather station (within 25 km) and fetches its actual observed data via the official live API (login + station query, confirmed by direct testing to reject future dates - it serves observed readings only, not a forecast). Scoped to Point Lookup only, not the Statewide Map: querying all ~2,300 stations for a single day returns roughly 1 million raw readings, timed at about 7 minutes to fully page through - impractical for an on-demand map click, whereas a single station's data returns in under a second. API credentials are kept out of the codebase entirely, via Streamlit's secrets mechanism.</w:t>
       </w:r>
     </w:p>
     <w:sectPr>

</xml_diff>